<commit_message>
docs: retake UI screenshots with the 100-passenger seed data
The demo booking is now reservation 42 (Somsak Jaidee with Dao Jantarawong
and Narong Kongkaew, seats 3B-3D on MW101). Both Word reports are rebuilt
with the new screenshots and captions.
</commit_message>
<xml_diff>
--- a/docs/Meow-Airline-Report-20p.docx
+++ b/docs/Meow-Airline-Report-20p.docx
@@ -10221,7 +10221,7 @@
         <w:rPr>
           <w:sz w:val="21"/>
         </w:rPr>
-        <w:t>Book the Jaidee family of 3 on MW101 (seats 3B, 3C, 3D) → pay 4,500 THB → issue the tickets → check in → read the reports.</w:t>
+        <w:t>Book a group of 3 on MW101 (seats 3B, 3C, 3D) → pay 4,500 THB → issue the tickets → check in → read the reports.</w:t>
       </w:r>
     </w:p>
     <w:tbl>
@@ -10288,7 +10288,7 @@
                 <w:b/>
                 <w:sz w:val="19"/>
               </w:rPr>
-              <w:t>1 · Book a family of 3</w:t>
+              <w:t>1 · Book a group of 3</w:t>
             </w:r>
           </w:p>
         </w:tc>

</xml_diff>

<commit_message>
docs: Word reports say the app is hosted on Railway, with the live link
Co-Authored-By: Claude Opus 5.5 <noreply@anthropic.com>
</commit_message>
<xml_diff>
--- a/docs/Meow-Airline-Report-20p.docx
+++ b/docs/Meow-Airline-Report-20p.docx
@@ -101,7 +101,7 @@
                 <w:color w:val="5B6794"/>
                 <w:sz w:val="18"/>
               </w:rPr>
-              <w:t>Source code: github.com/tapimeow/Meow-Airline-SE212</w:t>
+              <w:t>Source code: github.com/tapimeow/Meow-Airline-SE212 · Live site: meow-airline.up.railway.app</w:t>
             </w:r>
           </w:p>
         </w:tc>
@@ -8399,7 +8399,7 @@
               <w:rPr>
                 <w:sz w:val="19"/>
               </w:rPr>
-              <w:t>.env, not in Git</w:t>
+              <w:t>.env locally, Railway variables online</w:t>
             </w:r>
           </w:p>
         </w:tc>
@@ -9087,7 +9087,7 @@
               <w:rPr>
                 <w:sz w:val="22"/>
               </w:rPr>
-              <w:t>Local laptop</w:t>
+              <w:t>Railway</w:t>
             </w:r>
           </w:p>
         </w:tc>
@@ -9103,7 +9103,7 @@
               <w:rPr>
                 <w:sz w:val="22"/>
               </w:rPr>
-              <w:t>The live demo runs MySQL and the Node server on one laptop; no cloud</w:t>
+              <w:t>The app and its MySQL database run on Railway; every push to main redeploys</w:t>
             </w:r>
           </w:p>
         </w:tc>

</xml_diff>

<commit_message>
docs: report pictures and Word files for the Nov-Dec data and new screens
- Q9, Q13, Q14 and Q20 re-captured on the new seed data.
- UI screenshots retaken: typed travellers on the booking form, reservation
  156, passport on the boarding pass, search by name or passport, month list;
  new 03b-ticket.png for the ticket page.
- Both Word reports rebuilt (the 20-page one is still 20 pages).
</commit_message>
<xml_diff>
--- a/docs/Meow-Airline-Report-20p.docx
+++ b/docs/Meow-Airline-Report-20p.docx
@@ -150,13 +150,13 @@
           <w:b/>
           <w:sz w:val="21"/>
         </w:rPr>
-        <w:t>6 aircraft</w:t>
+        <w:t>8 aircraft</w:t>
       </w:r>
       <w:r>
         <w:rPr>
           <w:sz w:val="21"/>
         </w:rPr>
-        <w:t xml:space="preserve"> on domestic Thai routes and to Singapore and Vientiane. Its agents book passengers, take payment and check them in at the airport. This report designs and builds the MySQL database that replaces the airline's spreadsheet.</w:t>
+        <w:t xml:space="preserve"> on domestic Thai routes and to Singapore, Vientiane, Tokyo and Hong Kong. Its agents book passengers, take payment and check them in at the airport. This report designs and builds the MySQL database that replaces the airline's spreadsheet.</w:t>
       </w:r>
     </w:p>
     <w:p>
@@ -10221,7 +10221,7 @@
         <w:rPr>
           <w:sz w:val="21"/>
         </w:rPr>
-        <w:t>Book a group of 3 on MW101 (seats 3B, 3C, 3D) → pay 4,500 THB → issue the tickets → check in → read the reports.</w:t>
+        <w:t>Booking staff types in a group of 3 by name and passport on MW101 (seats 3B, 3C, 3D) → pay 4,500 THB → issue the tickets → check in → read the reports.</w:t>
       </w:r>
     </w:p>
     <w:tbl>
@@ -10246,7 +10246,7 @@
             <w:r>
               <w:drawing>
                 <wp:inline xmlns:a="http://schemas.openxmlformats.org/drawingml/2006/main" xmlns:pic="http://schemas.openxmlformats.org/drawingml/2006/picture">
-                  <wp:extent cx="2384775" cy="2232000"/>
+                  <wp:extent cx="2070261" cy="2232000"/>
                   <wp:docPr id="4" name="Picture 4"/>
                   <wp:cNvGraphicFramePr>
                     <a:graphicFrameLocks noChangeAspect="1"/>
@@ -10267,7 +10267,7 @@
                         <pic:spPr>
                           <a:xfrm>
                             <a:off x="0" y="0"/>
-                            <a:ext cx="2384775" cy="2232000"/>
+                            <a:ext cx="2070261" cy="2232000"/>
                           </a:xfrm>
                           <a:prstGeom prst="rect"/>
                         </pic:spPr>
@@ -10535,7 +10535,7 @@
             <w:r>
               <w:drawing>
                 <wp:inline xmlns:a="http://schemas.openxmlformats.org/drawingml/2006/main" xmlns:pic="http://schemas.openxmlformats.org/drawingml/2006/picture">
-                  <wp:extent cx="2880000" cy="1989000"/>
+                  <wp:extent cx="2880000" cy="1993500"/>
                   <wp:docPr id="9" name="Picture 9"/>
                   <wp:cNvGraphicFramePr>
                     <a:graphicFrameLocks noChangeAspect="1"/>
@@ -10556,7 +10556,7 @@
                         <pic:spPr>
                           <a:xfrm>
                             <a:off x="0" y="0"/>
-                            <a:ext cx="2880000" cy="1989000"/>
+                            <a:ext cx="2880000" cy="1993500"/>
                           </a:xfrm>
                           <a:prstGeom prst="rect"/>
                         </pic:spPr>

</xml_diff>

<commit_message>
docs: Word reports use Kawintida and American spelling
Kawinthida -> Kawintida (7 in the full report, 5 in the 20-page one) and
specialisation -> specialization, matching the report and slides.
</commit_message>
<xml_diff>
--- a/docs/Meow-Airline-Report-20p.docx
+++ b/docs/Meow-Airline-Report-20p.docx
@@ -89,7 +89,7 @@
                 <w:color w:val="5B6794"/>
                 <w:sz w:val="19"/>
               </w:rPr>
-              <w:t>Patarawadee Kunna 682115034 · Kawinthida Kantong 682115002 · Kornnaphat Uttama 682115001</w:t>
+              <w:t>Patarawadee Kunna 682115034 · Kawintida Kantong 682115002 · Kornnaphat Uttama 682115001</w:t>
             </w:r>
           </w:p>
           <w:p>
@@ -6569,7 +6569,7 @@
           <w:color w:val="2A3566"/>
           <w:sz w:val="40"/>
         </w:rPr>
-        <w:t>Specialisation → one table per subtype</w:t>
+        <w:t>Specialization → one table per subtype</w:t>
       </w:r>
     </w:p>
     <w:p>
@@ -9558,7 +9558,7 @@
               <w:rPr>
                 <w:sz w:val="19"/>
               </w:rPr>
-              <w:t>Kawinthida, Kornnaphat</w:t>
+              <w:t>Kawintida, Kornnaphat</w:t>
             </w:r>
           </w:p>
         </w:tc>
@@ -9656,7 +9656,7 @@
               <w:rPr>
                 <w:sz w:val="19"/>
               </w:rPr>
-              <w:t>Kawinthida</w:t>
+              <w:t>Kawintida</w:t>
             </w:r>
           </w:p>
         </w:tc>
@@ -9738,7 +9738,7 @@
               <w:rPr>
                 <w:sz w:val="19"/>
               </w:rPr>
-              <w:t>Kawinthida</w:t>
+              <w:t>Kawintida</w:t>
             </w:r>
           </w:p>
         </w:tc>
@@ -9836,7 +9836,7 @@
               <w:rPr>
                 <w:sz w:val="19"/>
               </w:rPr>
-              <w:t>Kawinthida, Kornnaphat</w:t>
+              <w:t>Kawintida, Kornnaphat</w:t>
             </w:r>
           </w:p>
         </w:tc>

</xml_diff>